<commit_message>
Plano 011: vincula Learning Cards ao Test Card executado
</commit_message>
<xml_diff>
--- a/_SAMPLES_ENTREGAVEIS/learning_card/sample-learning-card-v1.0.0.docx
+++ b/_SAMPLES_ENTREGAVEIS/learning_card/sample-learning-card-v1.0.0.docx
@@ -8,6 +8,11 @@
       </w:pPr>
       <w:r>
         <w:t>EXEMPLO FICTÍCIO — Learning Card LC-01</w:t>
+      </w:r>
+    </w:p>
+    <w:p>
+      <w:r>
+        <w:t>Test Card: sample-test-card v1.0.0</w:t>
       </w:r>
     </w:p>
     <w:p>

</xml_diff>